<commit_message>
Clarify GitHub as primary link and why Replit URL is absent.
Document archive vs Cursor follow-up in DZ-1 hotel report, PZ, and docx builder output.

Co-authored-by: Cursor <cursoragent@cursor.com>
</commit_message>
<xml_diff>
--- a/exports/PZ_travel-hotel-analytics_отчёт_для_сдачи.docx
+++ b/exports/PZ_travel-hotel-analytics_отчёт_для_сдачи.docx
@@ -95,6 +95,17 @@
         <w:rPr>
           <w:b/>
         </w:rPr>
+        <w:t xml:space="preserve">Replit (URL): </w:t>
+      </w:r>
+      <w:r>
+        <w:t>нет — см. раздел 2</w:t>
+      </w:r>
+    </w:p>
+    <w:p>
+      <w:r>
+        <w:rPr>
+          <w:b/>
+        </w:rPr>
         <w:t xml:space="preserve">Часть ДЗ: </w:t>
       </w:r>
       <w:r>
@@ -120,7 +131,170 @@
         <w:pStyle w:val="Heading1"/>
       </w:pPr>
       <w:r>
-        <w:t>2. Реализованный функционал</w:t>
+        <w:t>2. Где проект и почему нет ссылки на Replit</w:t>
+      </w:r>
+    </w:p>
+    <w:tbl>
+      <w:tblPr>
+        <w:tblStyle w:val="TableGrid"/>
+        <w:tblW w:type="auto" w:w="0"/>
+        <w:tblLook w:firstColumn="1" w:firstRow="1" w:lastColumn="0" w:lastRow="0" w:noHBand="0" w:noVBand="1" w:val="04A0"/>
+      </w:tblPr>
+      <w:tblGrid>
+        <w:gridCol w:w="4844"/>
+        <w:gridCol w:w="4844"/>
+      </w:tblGrid>
+      <w:tr>
+        <w:tc>
+          <w:tcPr>
+            <w:tcW w:type="dxa" w:w="4844"/>
+          </w:tcPr>
+          <w:p>
+            <w:r>
+              <w:rPr>
+                <w:b/>
+              </w:rPr>
+              <w:t>Вопрос</w:t>
+            </w:r>
+          </w:p>
+        </w:tc>
+        <w:tc>
+          <w:tcPr>
+            <w:tcW w:type="dxa" w:w="4844"/>
+          </w:tcPr>
+          <w:p>
+            <w:r>
+              <w:rPr>
+                <w:b/>
+              </w:rPr>
+              <w:t>Ответ</w:t>
+            </w:r>
+          </w:p>
+        </w:tc>
+      </w:tr>
+      <w:tr>
+        <w:tc>
+          <w:tcPr>
+            <w:tcW w:type="dxa" w:w="4844"/>
+          </w:tcPr>
+          <w:p>
+            <w:r>
+              <w:t>Где актуальный код?</w:t>
+            </w:r>
+          </w:p>
+        </w:tc>
+        <w:tc>
+          <w:tcPr>
+            <w:tcW w:type="dxa" w:w="4844"/>
+          </w:tcPr>
+          <w:p>
+            <w:r>
+              <w:t>GitHub — github.com/igrgor/AIKIVAVIORA-Travel-MCP-Workspace</w:t>
+            </w:r>
+          </w:p>
+        </w:tc>
+      </w:tr>
+      <w:tr>
+        <w:tc>
+          <w:tcPr>
+            <w:tcW w:type="dxa" w:w="4844"/>
+          </w:tcPr>
+          <w:p>
+            <w:r>
+              <w:t>Была ли версия на Replit?</w:t>
+            </w:r>
+          </w:p>
+        </w:tc>
+        <w:tc>
+          <w:tcPr>
+            <w:tcW w:type="dxa" w:w="4844"/>
+          </w:tcPr>
+          <w:p>
+            <w:r>
+              <w:t>Да, UI Shell v1.0 → архив Hotel-Insight-Hub.zip</w:t>
+            </w:r>
+          </w:p>
+        </w:tc>
+      </w:tr>
+      <w:tr>
+        <w:tc>
+          <w:tcPr>
+            <w:tcW w:type="dxa" w:w="4844"/>
+          </w:tcPr>
+          <w:p>
+            <w:r>
+              <w:t>Почему нет .replit.app?</w:t>
+            </w:r>
+          </w:p>
+        </w:tc>
+        <w:tc>
+          <w:tcPr>
+            <w:tcW w:type="dxa" w:w="4844"/>
+          </w:tcPr>
+          <w:p>
+            <w:r>
+              <w:t>Лимит Replit после части 1; доработки в Cursor, без нового Publish</w:t>
+            </w:r>
+          </w:p>
+        </w:tc>
+      </w:tr>
+      <w:tr>
+        <w:tc>
+          <w:tcPr>
+            <w:tcW w:type="dxa" w:w="4844"/>
+          </w:tcPr>
+          <w:p>
+            <w:r>
+              <w:t>Как проверить?</w:t>
+            </w:r>
+          </w:p>
+        </w:tc>
+        <w:tc>
+          <w:tcPr>
+            <w:tcW w:type="dxa" w:w="4844"/>
+          </w:tcPr>
+          <w:p>
+            <w:r>
+              <w:t>git clone → pnpm install → :3001 + :5173; скрины — локальный запуск</w:t>
+            </w:r>
+          </w:p>
+        </w:tc>
+      </w:tr>
+      <w:tr>
+        <w:tc>
+          <w:tcPr>
+            <w:tcW w:type="dxa" w:w="4844"/>
+          </w:tcPr>
+          <w:p>
+            <w:r>
+              <w:t>Чем заменяем Replit URL?</w:t>
+            </w:r>
+          </w:p>
+        </w:tc>
+        <w:tc>
+          <w:tcPr>
+            <w:tcW w:type="dxa" w:w="4844"/>
+          </w:tcPr>
+          <w:p>
+            <w:r>
+              <w:t>GitHub + архив + скриншоты в отчёте</w:t>
+            </w:r>
+          </w:p>
+        </w:tc>
+      </w:tr>
+    </w:tbl>
+    <w:p/>
+    <w:p>
+      <w:r>
+        <w:t>Часть 1 ДЗ (крипта) сдана с Replit URL. Часть 2 (отели) — с GitHub как основной ссылкой.</w:t>
+      </w:r>
+    </w:p>
+    <w:p>
+      <w:pPr>
+        <w:pStyle w:val="Heading1"/>
+      </w:pPr>
+      <w:r>
+        <w:t>3. Реализованный функционал</w:t>
       </w:r>
     </w:p>
     <w:tbl>
@@ -300,7 +474,7 @@
         <w:pStyle w:val="Heading1"/>
       </w:pPr>
       <w:r>
-        <w:t>3. Тест-сценарии</w:t>
+        <w:t>4. Тест-сценарии</w:t>
       </w:r>
     </w:p>
     <w:p>
@@ -830,7 +1004,7 @@
         <w:pStyle w:val="Heading1"/>
       </w:pPr>
       <w:r>
-        <w:t>4. Скрины процесса</w:t>
+        <w:t>5. Скрины процесса</w:t>
       </w:r>
     </w:p>
     <w:p>
@@ -928,7 +1102,7 @@
         <w:pStyle w:val="Heading1"/>
       </w:pPr>
       <w:r>
-        <w:t>5. В разработке (не баг)</w:t>
+        <w:t>6. В разработке (не баг)</w:t>
       </w:r>
     </w:p>
     <w:p>
@@ -976,7 +1150,7 @@
         <w:pStyle w:val="Heading1"/>
       </w:pPr>
       <w:r>
-        <w:t>6. Чеклист сдачи</w:t>
+        <w:t>7. Чеклист сдачи</w:t>
       </w:r>
     </w:p>
     <w:tbl>
@@ -1024,7 +1198,7 @@
           </w:tcPr>
           <w:p>
             <w:r>
-              <w:t>GitHub / архив</w:t>
+              <w:t>GitHub (основная ссылка)</w:t>
             </w:r>
           </w:p>
         </w:tc>
@@ -1035,6 +1209,50 @@
           <w:p>
             <w:r>
               <w:t>✅</w:t>
+            </w:r>
+          </w:p>
+        </w:tc>
+      </w:tr>
+      <w:tr>
+        <w:tc>
+          <w:tcPr>
+            <w:tcW w:type="dxa" w:w="4844"/>
+          </w:tcPr>
+          <w:p>
+            <w:r>
+              <w:t>Архив Replit v1.0</w:t>
+            </w:r>
+          </w:p>
+        </w:tc>
+        <w:tc>
+          <w:tcPr>
+            <w:tcW w:type="dxa" w:w="4844"/>
+          </w:tcPr>
+          <w:p>
+            <w:r>
+              <w:t>✅ Hotel-Insight-Hub.zip</w:t>
+            </w:r>
+          </w:p>
+        </w:tc>
+      </w:tr>
+      <w:tr>
+        <w:tc>
+          <w:tcPr>
+            <w:tcW w:type="dxa" w:w="4844"/>
+          </w:tcPr>
+          <w:p>
+            <w:r>
+              <w:t>Публичный URL Replit</w:t>
+            </w:r>
+          </w:p>
+        </w:tc>
+        <w:tc>
+          <w:tcPr>
+            <w:tcW w:type="dxa" w:w="4844"/>
+          </w:tcPr>
+          <w:p>
+            <w:r>
+              <w:t>❌ нет — раздел 2</w:t>
             </w:r>
           </w:p>
         </w:tc>
@@ -1068,7 +1286,7 @@
           </w:tcPr>
           <w:p>
             <w:r>
-              <w:t>Скриншоты</w:t>
+              <w:t>Скриншоты (локально)</w:t>
             </w:r>
           </w:p>
         </w:tc>

</xml_diff>